<commit_message>
Deploying to gh-pages from @ Morrison-Lab/win@05ef6b4ac33535aa57f5f2d8acd5dd64c476144f 🚀
</commit_message>
<xml_diff>
--- a/chapters/03-observational-studies.docx
+++ b/chapters/03-observational-studies.docx
@@ -5428,6 +5428,9 @@
           <w:p>
             <w:pPr>
               <w:pStyle w:val="BodyText"/>
+            </w:pPr>
+            <w:pPr>
+              <w:spacing w:before="16"/>
             </w:pPr>
             <w:r>
               <w:t xml:space="preserve">Fine Point 2.1 identified individual effects in crossover experiments (periods</w:t>
@@ -7741,6 +7744,9 @@
           <w:p>
             <w:pPr>
               <w:pStyle w:val="FirstParagraph"/>
+            </w:pPr>
+            <w:pPr>
+              <w:spacing w:after="16"/>
             </w:pPr>
             <w:r>
               <w:t xml:space="preserve">If only (i) holds, the same mean estimates</w:t>
@@ -17918,6 +17924,9 @@
             <w:pPr>
               <w:pStyle w:val="BodyText"/>
             </w:pPr>
+            <w:pPr>
+              <w:spacing w:before="16"/>
+            </w:pPr>
             <w:r>
               <w:t xml:space="preserve">“The effect of heart transplant”</w:t>
             </w:r>
@@ -18004,6 +18013,9 @@
             <w:pPr>
               <w:pStyle w:val="FirstParagraph"/>
             </w:pPr>
+            <w:pPr>
+              <w:spacing w:after="16"/>
+            </w:pPr>
             <w:r>
               <w:t xml:space="preserve">Interpretation (ii), an average of</w:t>
             </w:r>
@@ -18050,14 +18062,6 @@
         </w:tc>
       </w:tr>
     </w:tbl>
-    <w:p>
-      <w:pPr>
-        <w:pStyle w:val="BodyText"/>
-      </w:pPr>
-      <w:r>
-        <w:t xml:space="preserve"> </w:t>
-      </w:r>
-    </w:p>
     <w:tbl>
       <w:tblPr>
         <w:tblStyle w:val="Table"/>

</xml_diff>